<commit_message>
Release v1.8.2 progress visibility
</commit_message>
<xml_diff>
--- a/docs/AHV-Appliance-Build-Guide.docx
+++ b/docs/AHV-Appliance-Build-Guide.docx
@@ -278,7 +278,7 @@
           </ns0:tcPr>
           <ns0:p>
             <ns0:r>
-              <ns0:t>v1.8.1</ns0:t>
+              <ns0:t>v1.8.2</ns0:t>
             </ns0:r>
           </ns0:p>
         </ns0:tc>
@@ -287,7 +287,7 @@
     <ns0:p ns2:paraId="493DA093" ns2:textId="77777777" ns0:rsidR="00E01221" ns0:rsidRDefault="00E01221"/>
     <ns0:p ns2:paraId="5C45F4A7" ns2:textId="77777777" ns0:rsidR="00E01221" ns0:rsidRDefault="00E02EFA">
       <ns0:r>
-        <ns0:t>Purpose. This guide describes how to build a portable ZTF-Orchestrator AHV appliance for connected staging or air-gapped Nutanix AHV environments. For this source tree, the current ZTF-Orchestrator release is v1.8.1. The current build process can bake the ZTF-Orchestrator application image, legacy ZeroTouch Framework v1.5.2, and NKP framework assets into the QCOW2 before transfer.</ns0:t>
+        <ns0:t>Purpose. This guide describes how to build a portable ZTF-Orchestrator AHV appliance for connected staging or air-gapped Nutanix AHV environments. For this source tree, the current ZTF-Orchestrator release is v1.8.2. The current build process can bake the ZTF-Orchestrator application image, legacy ZeroTouch Framework v1.5.2, and NKP framework assets into the QCOW2 before transfer.</ns0:t>
       </ns0:r>
     </ns0:p>
     <ns0:p ns2:paraId="02C78EED" ns2:textId="77777777" ns0:rsidR="00E01221" ns0:rsidRDefault="00E02EFA">
@@ -482,7 +482,7 @@
           </ns0:tcPr>
           <ns0:p>
             <ns0:r>
-              <ns0:t>v1.8.1 or main</ns0:t>
+              <ns0:t>v1.8.2 or main</ns0:t>
             </ns0:r>
           </ns0:p>
         </ns0:tc>
@@ -535,7 +535,7 @@
           </ns0:tcPr>
           <ns0:p>
             <ns0:r>
-              <ns0:t>v1.8.1 or latest</ns0:t>
+              <ns0:t>v1.8.2 or latest</ns0:t>
             </ns0:r>
           </ns0:p>
         </ns0:tc>
@@ -1038,7 +1038,7 @@
           <ns0:sz ns0:val="17"/>
         </ns0:rPr>
         <ns0:br/>
-        <ns0:t>VERSION=v1.8.1 \</ns0:t>
+        <ns0:t>VERSION=v1.8.2 \</ns0:t>
       </ns0:r>
       <ns0:r>
         <ns0:rPr>
@@ -1047,7 +1047,7 @@
           <ns0:sz ns0:val="17"/>
         </ns0:rPr>
         <ns0:br/>
-        <ns0:t>ZTF_ORCHESTRATOR_VERSION=v1.8.1 \</ns0:t>
+        <ns0:t>ZTF_ORCHESTRATOR_VERSION=v1.8.2 \</ns0:t>
       </ns0:r>
       <ns0:r>
         <ns0:rPr>

</xml_diff>

<commit_message>
Release v1.8.3 light details panes
</commit_message>
<xml_diff>
--- a/docs/AHV-Appliance-Build-Guide.docx
+++ b/docs/AHV-Appliance-Build-Guide.docx
@@ -278,7 +278,7 @@
           </ns0:tcPr>
           <ns0:p>
             <ns0:r>
-              <ns0:t>v1.8.2</ns0:t>
+              <ns0:t>v1.8.3</ns0:t>
             </ns0:r>
           </ns0:p>
         </ns0:tc>
@@ -287,7 +287,7 @@
     <ns0:p ns2:paraId="493DA093" ns2:textId="77777777" ns0:rsidR="00E01221" ns0:rsidRDefault="00E01221"/>
     <ns0:p ns2:paraId="5C45F4A7" ns2:textId="77777777" ns0:rsidR="00E01221" ns0:rsidRDefault="00E02EFA">
       <ns0:r>
-        <ns0:t>Purpose. This guide describes how to build a portable ZTF-Orchestrator AHV appliance for connected staging or air-gapped Nutanix AHV environments. For this source tree, the current ZTF-Orchestrator release is v1.8.2. The current build process can bake the ZTF-Orchestrator application image, legacy ZeroTouch Framework v1.5.2, and NKP framework assets into the QCOW2 before transfer.</ns0:t>
+        <ns0:t>Purpose. This guide describes how to build a portable ZTF-Orchestrator AHV appliance for connected staging or air-gapped Nutanix AHV environments. For this source tree, the current ZTF-Orchestrator release is v1.8.3. The current build process can bake the ZTF-Orchestrator application image, legacy ZeroTouch Framework v1.5.2, and NKP framework assets into the QCOW2 before transfer.</ns0:t>
       </ns0:r>
     </ns0:p>
     <ns0:p ns2:paraId="02C78EED" ns2:textId="77777777" ns0:rsidR="00E01221" ns0:rsidRDefault="00E02EFA">
@@ -482,7 +482,7 @@
           </ns0:tcPr>
           <ns0:p>
             <ns0:r>
-              <ns0:t>v1.8.2 or main</ns0:t>
+              <ns0:t>v1.8.3 or main</ns0:t>
             </ns0:r>
           </ns0:p>
         </ns0:tc>
@@ -535,7 +535,7 @@
           </ns0:tcPr>
           <ns0:p>
             <ns0:r>
-              <ns0:t>v1.8.2 or latest</ns0:t>
+              <ns0:t>v1.8.3 or latest</ns0:t>
             </ns0:r>
           </ns0:p>
         </ns0:tc>
@@ -1038,7 +1038,7 @@
           <ns0:sz ns0:val="17"/>
         </ns0:rPr>
         <ns0:br/>
-        <ns0:t>VERSION=v1.8.2 \</ns0:t>
+        <ns0:t>VERSION=v1.8.3 \</ns0:t>
       </ns0:r>
       <ns0:r>
         <ns0:rPr>
@@ -1047,7 +1047,7 @@
           <ns0:sz ns0:val="17"/>
         </ns0:rPr>
         <ns0:br/>
-        <ns0:t>ZTF_ORCHESTRATOR_VERSION=v1.8.2 \</ns0:t>
+        <ns0:t>ZTF_ORCHESTRATOR_VERSION=v1.8.3 \</ns0:t>
       </ns0:r>
       <ns0:r>
         <ns0:rPr>

</xml_diff>

<commit_message>
Prepare v1.8.5-rc1 stabilization candidate and release gates
</commit_message>
<xml_diff>
--- a/docs/AHV-Appliance-Build-Guide.docx
+++ b/docs/AHV-Appliance-Build-Guide.docx
@@ -1,6 +1,6 @@
 
 <file path=word/document.xml><?xml version="1.0" encoding="utf-8"?>
-<ns0:document xmlns:ns0="http://schemas.openxmlformats.org/wordprocessingml/2006/main" xmlns:ns1="http://schemas.openxmlformats.org/markup-compatibility/2006" xmlns:ns2="http://schemas.microsoft.com/office/word/2010/wordml" ns1:Ignorable="w14 w15 w16se w16cid w16 w16cex w16sdtdh w16sdtfl w16du wp14">
+<ns0:document xmlns:ns0="http://schemas.openxmlformats.org/wordprocessingml/2006/main" xmlns:ns1="http://schemas.openxmlformats.org/markup-compatibility/2006" xmlns:ns2="http://schemas.microsoft.com/office/word/2010/wordml">
   <ns0:body>
     <ns0:p ns2:paraId="3477A6BD" ns2:textId="77777777" ns0:rsidR="00E01221" ns0:rsidRDefault="00E02EFA">
       <ns0:pPr>
@@ -278,7 +278,7 @@
           </ns0:tcPr>
           <ns0:p>
             <ns0:r>
-              <ns0:t>v1.8.4</ns0:t>
+              <ns0:t>v1.8.5-rc1</ns0:t>
             </ns0:r>
           </ns0:p>
         </ns0:tc>
@@ -287,7 +287,7 @@
     <ns0:p ns2:paraId="493DA093" ns2:textId="77777777" ns0:rsidR="00E01221" ns0:rsidRDefault="00E01221"/>
     <ns0:p ns2:paraId="5C45F4A7" ns2:textId="77777777" ns0:rsidR="00E01221" ns0:rsidRDefault="00E02EFA">
       <ns0:r>
-        <ns0:t>Purpose. This guide describes how to build a portable ZTF-Orchestrator AHV appliance for connected staging or air-gapped Nutanix AHV environments. For this source tree, the current ZTF-Orchestrator release is v1.8.4. The current build process can bake the ZTF-Orchestrator application image, legacy ZeroTouch Framework v1.5.2, and NKP framework assets into the QCOW2 before transfer.</ns0:t>
+        <ns0:t>Purpose. This guide describes how to build a portable ZTF-Orchestrator AHV appliance for connected staging or air-gapped Nutanix AHV environments. For this source tree, the current ZTF-Orchestrator release is v1.8.5-rc1. The current build process can bake the ZTF-Orchestrator application image, legacy ZeroTouch Framework v1.5.2, and NKP framework assets into the QCOW2 before transfer.</ns0:t>
       </ns0:r>
     </ns0:p>
     <ns0:p ns2:paraId="02C78EED" ns2:textId="77777777" ns0:rsidR="00E01221" ns0:rsidRDefault="00E02EFA">
@@ -482,7 +482,7 @@
           </ns0:tcPr>
           <ns0:p>
             <ns0:r>
-              <ns0:t>v1.8.4 or main</ns0:t>
+              <ns0:t>v1.8.5-rc1 or main</ns0:t>
             </ns0:r>
           </ns0:p>
         </ns0:tc>
@@ -535,7 +535,7 @@
           </ns0:tcPr>
           <ns0:p>
             <ns0:r>
-              <ns0:t>v1.8.4 or latest</ns0:t>
+              <ns0:t>v1.8.5-rc1 or latest</ns0:t>
             </ns0:r>
           </ns0:p>
         </ns0:tc>
@@ -1038,7 +1038,7 @@
           <ns0:sz ns0:val="17"/>
         </ns0:rPr>
         <ns0:br/>
-        <ns0:t>VERSION=v1.8.4 \</ns0:t>
+        <ns0:t>VERSION=v1.8.5-rc1 \</ns0:t>
       </ns0:r>
       <ns0:r>
         <ns0:rPr>
@@ -1047,7 +1047,7 @@
           <ns0:sz ns0:val="17"/>
         </ns0:rPr>
         <ns0:br/>
-        <ns0:t>ZTF_ORCHESTRATOR_VERSION=v1.8.4 \</ns0:t>
+        <ns0:t>ZTF_ORCHESTRATOR_VERSION=v1.8.5-rc1 \</ns0:t>
       </ns0:r>
       <ns0:r>
         <ns0:rPr>

</xml_diff>